<commit_message>
agrego el informe y actualizo el readme
Co-authored-by: Cursor <cursoragent@cursor.com>
</commit_message>
<xml_diff>
--- a/Informe_TP3_Pokedex.docx
+++ b/Informe_TP3_Pokedex.docx
@@ -2,6 +2,8 @@
 <file path=word/document.xml><?xml version="1.0" encoding="utf-8"?>
 <w:document xmlns:wpc="http://schemas.microsoft.com/office/word/2010/wordprocessingCanvas" xmlns:mo="http://schemas.microsoft.com/office/mac/office/2008/main" xmlns:mc="http://schemas.openxmlformats.org/markup-compatibility/2006" xmlns:mv="urn:schemas-microsoft-com:mac:vml" xmlns:o="urn:schemas-microsoft-com:office:office" xmlns:r="http://schemas.openxmlformats.org/officeDocument/2006/relationships" xmlns:m="http://schemas.openxmlformats.org/officeDocument/2006/math" xmlns:v="urn:schemas-microsoft-com:vml" xmlns:wp14="http://schemas.microsoft.com/office/word/2010/wordprocessingDrawing" xmlns:wp="http://schemas.openxmlformats.org/drawingml/2006/wordprocessingDrawing" xmlns:w10="urn:schemas-microsoft-com:office:word" xmlns:w="http://schemas.openxmlformats.org/wordprocessingml/2006/main" xmlns:w14="http://schemas.microsoft.com/office/word/2010/wordml" xmlns:wpg="http://schemas.microsoft.com/office/word/2010/wordprocessingGroup" xmlns:wpi="http://schemas.microsoft.com/office/word/2010/wordprocessingInk" xmlns:wne="http://schemas.microsoft.com/office/word/2006/wordml" xmlns:wps="http://schemas.microsoft.com/office/word/2010/wordprocessingShape" mc:Ignorable="w14 wp14">
   <w:body>
+    <w:p/>
+    <w:p/>
     <w:p>
       <w:pPr>
         <w:jc w:val="center"/>
@@ -10,7 +12,8 @@
         <w:rPr>
           <w:rFonts w:ascii="Calibri" w:hAnsi="Calibri" w:eastAsia="Calibri"/>
           <w:b/>
-          <w:sz w:val="32"/>
+          <w:color w:val="C03014"/>
+          <w:sz w:val="28"/>
         </w:rPr>
         <w:t>TRABAJO PRACTICO FINAL</w:t>
       </w:r>
@@ -23,7 +26,8 @@
         <w:rPr>
           <w:rFonts w:ascii="Calibri" w:hAnsi="Calibri" w:eastAsia="Calibri"/>
           <w:b/>
-          <w:sz w:val="52"/>
+          <w:color w:val="202020"/>
+          <w:sz w:val="64"/>
         </w:rPr>
         <w:t>Pokedex</w:t>
       </w:r>
@@ -36,121 +40,296 @@
         <w:rPr>
           <w:rFonts w:ascii="Calibri" w:hAnsi="Calibri" w:eastAsia="Calibri"/>
           <w:b w:val="0"/>
-          <w:sz w:val="28"/>
+          <w:sz w:val="32"/>
         </w:rPr>
-        <w:t>Programacion III - 2026</w:t>
+        <w:t>API, Vue.js y Pinia</w:t>
       </w:r>
     </w:p>
     <w:p/>
+    <w:tbl>
+      <w:tblPr>
+        <w:tblStyle w:val="TableGrid"/>
+        <w:tblW w:type="auto" w:w="0"/>
+        <w:jc w:val="center"/>
+        <w:tblLook w:firstColumn="1" w:firstRow="1" w:lastColumn="0" w:lastRow="0" w:noHBand="0" w:noVBand="1" w:val="04A0"/>
+      </w:tblPr>
+      <w:tblGrid>
+        <w:gridCol w:w="4816"/>
+        <w:gridCol w:w="4816"/>
+      </w:tblGrid>
+      <w:tr>
+        <w:tc>
+          <w:tcPr>
+            <w:tcW w:type="dxa" w:w="2551"/>
+            <w:shd w:fill="C03014" w:val="clear"/>
+          </w:tcPr>
+          <w:p>
+            <w:r/>
+            <w:r>
+              <w:rPr>
+                <w:rFonts w:ascii="Calibri" w:hAnsi="Calibri" w:eastAsia="Calibri"/>
+                <w:b/>
+                <w:color w:val="FFFFFF"/>
+                <w:sz w:val="24"/>
+              </w:rPr>
+              <w:t>Materia</w:t>
+            </w:r>
+          </w:p>
+        </w:tc>
+        <w:tc>
+          <w:tcPr>
+            <w:tcW w:type="dxa" w:w="6236"/>
+          </w:tcPr>
+          <w:p>
+            <w:r/>
+            <w:r>
+              <w:rPr>
+                <w:rFonts w:ascii="Calibri" w:hAnsi="Calibri" w:eastAsia="Calibri"/>
+                <w:b w:val="0"/>
+                <w:sz w:val="24"/>
+              </w:rPr>
+              <w:t>Programacion III</w:t>
+            </w:r>
+          </w:p>
+        </w:tc>
+      </w:tr>
+      <w:tr>
+        <w:tc>
+          <w:tcPr>
+            <w:tcW w:type="dxa" w:w="2551"/>
+            <w:shd w:fill="C03014" w:val="clear"/>
+          </w:tcPr>
+          <w:p>
+            <w:r/>
+            <w:r>
+              <w:rPr>
+                <w:rFonts w:ascii="Calibri" w:hAnsi="Calibri" w:eastAsia="Calibri"/>
+                <w:b/>
+                <w:color w:val="FFFFFF"/>
+                <w:sz w:val="24"/>
+              </w:rPr>
+              <w:t>Nivel</w:t>
+            </w:r>
+          </w:p>
+        </w:tc>
+        <w:tc>
+          <w:tcPr>
+            <w:tcW w:type="dxa" w:w="6236"/>
+          </w:tcPr>
+          <w:p>
+            <w:r/>
+            <w:r>
+              <w:rPr>
+                <w:rFonts w:ascii="Calibri" w:hAnsi="Calibri" w:eastAsia="Calibri"/>
+                <w:b w:val="0"/>
+                <w:sz w:val="24"/>
+              </w:rPr>
+              <w:t>Secundaria</w:t>
+            </w:r>
+          </w:p>
+        </w:tc>
+      </w:tr>
+      <w:tr>
+        <w:tc>
+          <w:tcPr>
+            <w:tcW w:type="dxa" w:w="2551"/>
+            <w:shd w:fill="C03014" w:val="clear"/>
+          </w:tcPr>
+          <w:p>
+            <w:r/>
+            <w:r>
+              <w:rPr>
+                <w:rFonts w:ascii="Calibri" w:hAnsi="Calibri" w:eastAsia="Calibri"/>
+                <w:b/>
+                <w:color w:val="FFFFFF"/>
+                <w:sz w:val="24"/>
+              </w:rPr>
+              <w:t>Año</w:t>
+            </w:r>
+          </w:p>
+        </w:tc>
+        <w:tc>
+          <w:tcPr>
+            <w:tcW w:type="dxa" w:w="6236"/>
+          </w:tcPr>
+          <w:p>
+            <w:r/>
+            <w:r>
+              <w:rPr>
+                <w:rFonts w:ascii="Calibri" w:hAnsi="Calibri" w:eastAsia="Calibri"/>
+                <w:b w:val="0"/>
+                <w:sz w:val="24"/>
+              </w:rPr>
+              <w:t>2026</w:t>
+            </w:r>
+          </w:p>
+        </w:tc>
+      </w:tr>
+      <w:tr>
+        <w:tc>
+          <w:tcPr>
+            <w:tcW w:type="dxa" w:w="2551"/>
+            <w:shd w:fill="C03014" w:val="clear"/>
+          </w:tcPr>
+          <w:p>
+            <w:r/>
+            <w:r>
+              <w:rPr>
+                <w:rFonts w:ascii="Calibri" w:hAnsi="Calibri" w:eastAsia="Calibri"/>
+                <w:b/>
+                <w:color w:val="FFFFFF"/>
+                <w:sz w:val="24"/>
+              </w:rPr>
+              <w:t>Titulo</w:t>
+            </w:r>
+          </w:p>
+        </w:tc>
+        <w:tc>
+          <w:tcPr>
+            <w:tcW w:type="dxa" w:w="6236"/>
+          </w:tcPr>
+          <w:p>
+            <w:r/>
+            <w:r>
+              <w:rPr>
+                <w:rFonts w:ascii="Calibri" w:hAnsi="Calibri" w:eastAsia="Calibri"/>
+                <w:b w:val="0"/>
+                <w:sz w:val="24"/>
+              </w:rPr>
+              <w:t>Pokedex - Trabajo Practico Final</w:t>
+            </w:r>
+          </w:p>
+        </w:tc>
+      </w:tr>
+      <w:tr>
+        <w:tc>
+          <w:tcPr>
+            <w:tcW w:type="dxa" w:w="2551"/>
+            <w:shd w:fill="C03014" w:val="clear"/>
+          </w:tcPr>
+          <w:p>
+            <w:r/>
+            <w:r>
+              <w:rPr>
+                <w:rFonts w:ascii="Calibri" w:hAnsi="Calibri" w:eastAsia="Calibri"/>
+                <w:b/>
+                <w:color w:val="FFFFFF"/>
+                <w:sz w:val="24"/>
+              </w:rPr>
+              <w:t>Integrante</w:t>
+            </w:r>
+          </w:p>
+        </w:tc>
+        <w:tc>
+          <w:tcPr>
+            <w:tcW w:type="dxa" w:w="6236"/>
+          </w:tcPr>
+          <w:p>
+            <w:r/>
+            <w:r>
+              <w:rPr>
+                <w:rFonts w:ascii="Calibri" w:hAnsi="Calibri" w:eastAsia="Calibri"/>
+                <w:b w:val="0"/>
+                <w:sz w:val="24"/>
+              </w:rPr>
+              <w:t>Alejo Corti</w:t>
+            </w:r>
+          </w:p>
+        </w:tc>
+      </w:tr>
+      <w:tr>
+        <w:tc>
+          <w:tcPr>
+            <w:tcW w:type="dxa" w:w="2551"/>
+            <w:shd w:fill="C03014" w:val="clear"/>
+          </w:tcPr>
+          <w:p>
+            <w:r/>
+            <w:r>
+              <w:rPr>
+                <w:rFonts w:ascii="Calibri" w:hAnsi="Calibri" w:eastAsia="Calibri"/>
+                <w:b/>
+                <w:color w:val="FFFFFF"/>
+                <w:sz w:val="24"/>
+              </w:rPr>
+              <w:t>Rol</w:t>
+            </w:r>
+          </w:p>
+        </w:tc>
+        <w:tc>
+          <w:tcPr>
+            <w:tcW w:type="dxa" w:w="6236"/>
+          </w:tcPr>
+          <w:p>
+            <w:r/>
+            <w:r>
+              <w:rPr>
+                <w:rFonts w:ascii="Calibri" w:hAnsi="Calibri" w:eastAsia="Calibri"/>
+                <w:b w:val="0"/>
+                <w:sz w:val="24"/>
+              </w:rPr>
+              <w:t>Frontend (Vue/Pinia), backend y documentacion</w:t>
+            </w:r>
+          </w:p>
+        </w:tc>
+      </w:tr>
+    </w:tbl>
     <w:p>
+      <w:r>
+        <w:br w:type="page"/>
+      </w:r>
+    </w:p>
+    <w:p>
+      <w:pPr>
+        <w:spacing w:before="280" w:after="160"/>
+      </w:pPr>
+      <w:r>
+        <w:rPr>
+          <w:rFonts w:ascii="Calibri" w:hAnsi="Calibri" w:eastAsia="Calibri"/>
+          <w:b/>
+          <w:color w:val="C03014"/>
+          <w:sz w:val="32"/>
+        </w:rPr>
+        <w:t>1. Introduccion</w:t>
+      </w:r>
+    </w:p>
+    <w:p>
+      <w:pPr>
+        <w:spacing w:after="160"/>
+      </w:pPr>
       <w:r>
         <w:rPr>
           <w:rFonts w:ascii="Calibri" w:hAnsi="Calibri" w:eastAsia="Calibri"/>
           <w:b w:val="0"/>
           <w:sz w:val="24"/>
         </w:rPr>
-        <w:t>Materia: Programacion III</w:t>
+        <w:t>Este trabajo es una aplicacion web tipo Pokedex. La idea es mostrar los 151 pokemones de la primera generacion, dejar que el usuario arme un equipo personal (hasta 6) y guardar ese equipo en una base de datos MySQL.</w:t>
       </w:r>
     </w:p>
     <w:p>
+      <w:pPr>
+        <w:spacing w:after="160"/>
+      </w:pPr>
       <w:r>
         <w:rPr>
           <w:rFonts w:ascii="Calibri" w:hAnsi="Calibri" w:eastAsia="Calibri"/>
           <w:b w:val="0"/>
           <w:sz w:val="24"/>
         </w:rPr>
-        <w:t>Tema: Frontend con api y pinia</w:t>
+        <w:t>El proyecto se hizo como una SPA (una sola pagina). El listado, el buscador y el equipo se ven al mismo tiempo y se actualizan solos cuando cambian los datos en Pinia.</w:t>
       </w:r>
     </w:p>
     <w:p>
+      <w:pPr>
+        <w:spacing w:after="160"/>
+      </w:pPr>
       <w:r>
         <w:rPr>
           <w:rFonts w:ascii="Calibri" w:hAnsi="Calibri" w:eastAsia="Calibri"/>
           <w:b w:val="0"/>
           <w:sz w:val="24"/>
         </w:rPr>
-        <w:t>Integrantes:</w:t>
-      </w:r>
-    </w:p>
-    <w:p>
-      <w:r>
-        <w:rPr>
-          <w:rFonts w:ascii="Calibri" w:hAnsi="Calibri" w:eastAsia="Calibri"/>
-          <w:b w:val="0"/>
-          <w:sz w:val="24"/>
-        </w:rPr>
-        <w:t>Alejo _______________________________</w:t>
-      </w:r>
-    </w:p>
-    <w:p>
-      <w:r>
-        <w:rPr>
-          <w:rFonts w:ascii="Calibri" w:hAnsi="Calibri" w:eastAsia="Calibri"/>
-          <w:b w:val="0"/>
-          <w:sz w:val="24"/>
-        </w:rPr>
-        <w:t>_____________________________________</w:t>
-      </w:r>
-    </w:p>
-    <w:p>
-      <w:r>
-        <w:rPr>
-          <w:rFonts w:ascii="Calibri" w:hAnsi="Calibri" w:eastAsia="Calibri"/>
-          <w:b w:val="0"/>
-          <w:sz w:val="24"/>
-        </w:rPr>
-        <w:t>_____________________________________</w:t>
-      </w:r>
-    </w:p>
-    <w:p>
-      <w:r>
-        <w:rPr>
-          <w:rFonts w:ascii="Calibri" w:hAnsi="Calibri" w:eastAsia="Calibri"/>
-          <w:b w:val="0"/>
-          <w:sz w:val="24"/>
-        </w:rPr>
-        <w:t>Roles: completar (front / back / informe)</w:t>
-      </w:r>
-    </w:p>
-    <w:p>
-      <w:r>
-        <w:rPr>
-          <w:rFonts w:ascii="Calibri" w:hAnsi="Calibri" w:eastAsia="Calibri"/>
-          <w:b/>
-          <w:color w:val="B42814"/>
-          <w:sz w:val="32"/>
-        </w:rPr>
-        <w:t>1. Introduccion</w:t>
-      </w:r>
-    </w:p>
-    <w:p>
-      <w:r>
-        <w:rPr>
-          <w:rFonts w:ascii="Calibri" w:hAnsi="Calibri" w:eastAsia="Calibri"/>
-          <w:b w:val="0"/>
-          <w:sz w:val="24"/>
-        </w:rPr>
-        <w:t>En este trabajo hicimos una pokedex. Basicamente podes ver los 151 pokemones de la primera generacion, buscarlos por nombre y armar un equipo de hasta 6. Despues ese equipo se guarda en mysql.</w:t>
-      </w:r>
-    </w:p>
-    <w:p>
-      <w:r>
-        <w:rPr>
-          <w:rFonts w:ascii="Calibri" w:hAnsi="Calibri" w:eastAsia="Calibri"/>
-          <w:b w:val="0"/>
-          <w:sz w:val="24"/>
-        </w:rPr>
-        <w:t>Usamos vue 3 con script setup, pinia para los datos, axios para las llamadas y un backend en node. La api que usamos es la pokeapi.</w:t>
-      </w:r>
-    </w:p>
-    <w:p>
-      <w:r>
-        <w:rPr>
-          <w:rFonts w:ascii="Calibri" w:hAnsi="Calibri" w:eastAsia="Calibri"/>
-          <w:b w:val="0"/>
-          <w:sz w:val="24"/>
-        </w:rPr>
-        <w:t>Las tecnologias que usamos son:</w:t>
+        <w:t>Tecnologias utilizadas:</w:t>
       </w:r>
     </w:p>
     <w:p>
@@ -163,7 +342,7 @@
           <w:b w:val="0"/>
           <w:sz w:val="24"/>
         </w:rPr>
-        <w:t>Vue.js</w:t>
+        <w:t>Vue.js 3 con Composition API y &lt;script setup&gt;</w:t>
       </w:r>
     </w:p>
     <w:p>
@@ -176,7 +355,7 @@
           <w:b w:val="0"/>
           <w:sz w:val="24"/>
         </w:rPr>
-        <w:t>Pinia</w:t>
+        <w:t>Pinia para el estado global (lista, equipo y busqueda)</w:t>
       </w:r>
     </w:p>
     <w:p>
@@ -189,7 +368,7 @@
           <w:b w:val="0"/>
           <w:sz w:val="24"/>
         </w:rPr>
-        <w:t>Axios</w:t>
+        <w:t>Axios para las llamadas HTTP asincronicas</w:t>
       </w:r>
     </w:p>
     <w:p>
@@ -202,7 +381,7 @@
           <w:b w:val="0"/>
           <w:sz w:val="24"/>
         </w:rPr>
-        <w:t>PokeAPI</w:t>
+        <w:t>PokeAPI (https://pokeapi.co/api/v2/pokemon?limit=151)</w:t>
       </w:r>
     </w:p>
     <w:p>
@@ -215,7 +394,7 @@
           <w:b w:val="0"/>
           <w:sz w:val="24"/>
         </w:rPr>
-        <w:t>Node, express, mysql2, cors y body-parser</w:t>
+        <w:t>Backend en Node.js: Express, mysql2, cors y body-parser</w:t>
       </w:r>
     </w:p>
     <w:p>
@@ -228,58 +407,292 @@
           <w:b w:val="0"/>
           <w:sz w:val="24"/>
         </w:rPr>
-        <w:t>Mysql (xampp)</w:t>
+        <w:t>MySQL, base pokedex y tabla equipos</w:t>
       </w:r>
     </w:p>
     <w:p>
+      <w:pPr>
+        <w:spacing w:before="280" w:after="160"/>
+      </w:pPr>
       <w:r>
         <w:rPr>
           <w:rFonts w:ascii="Calibri" w:hAnsi="Calibri" w:eastAsia="Calibri"/>
           <w:b/>
-          <w:color w:val="B42814"/>
+          <w:color w:val="C03014"/>
           <w:sz w:val="32"/>
         </w:rPr>
         <w:t>2. Diseño y estructura</w:t>
       </w:r>
     </w:p>
     <w:p>
+      <w:pPr>
+        <w:spacing w:after="160"/>
+      </w:pPr>
       <w:r>
         <w:rPr>
           <w:rFonts w:ascii="Calibri" w:hAnsi="Calibri" w:eastAsia="Calibri"/>
           <w:b w:val="0"/>
           <w:sz w:val="24"/>
         </w:rPr>
-        <w:t>Separamos el front en 3 componentes porque lo pedia el enunciado. Al principio lo teniamos todo junto y era un lio, despues lo separamos.</w:t>
+        <w:t>El frontend esta separado en 3 componentes, como pedia el enunciado. Pinia es el lugar donde viven los datos que se comparten entre el listado y el equipo.</w:t>
       </w:r>
     </w:p>
     <w:p>
+      <w:pPr>
+        <w:spacing w:after="160"/>
+      </w:pPr>
       <w:r>
         <w:rPr>
           <w:rFonts w:ascii="Calibri" w:hAnsi="Calibri" w:eastAsia="Calibri"/>
           <w:b w:val="0"/>
           <w:sz w:val="24"/>
         </w:rPr>
-        <w:t>Mas o menos quedo asi:</w:t>
+        <w:t>Diagrama de componentes y store:</w:t>
       </w:r>
     </w:p>
     <w:p>
+      <w:pPr>
+        <w:spacing w:after="160"/>
+      </w:pPr>
       <w:r>
         <w:rPr>
           <w:rFonts w:ascii="Calibri" w:hAnsi="Calibri" w:eastAsia="Calibri"/>
           <w:b w:val="0"/>
           <w:sz w:val="24"/>
         </w:rPr>
-        <w:t>App.vue tiene el listado y el equipo. Listado.vue muestra las cartas (PokemonCard.vue) y Equipo.vue muestra lo que elegiste. Los dos usan el store Pinia_Pokemon.js. De ahi sale axios a la pokeapi y tambien al backend que esta en el puerto 3000, y el backend habla con mysql.</w:t>
+        <w:t xml:space="preserve">                         App.vue</w:t>
+        <w:br/>
+        <w:t xml:space="preserve">                    /               \</w:t>
+        <w:br/>
+        <w:t xml:space="preserve">           Listado.vue              Equipo.vue</w:t>
+        <w:br/>
+        <w:t xml:space="preserve">                 |</w:t>
+        <w:br/>
+        <w:t xml:space="preserve">          PokemonCard.vue</w:t>
+        <w:br/>
+        <w:t xml:space="preserve">                    \               /</w:t>
+        <w:br/>
+        <w:t xml:space="preserve">                 Pinia_Pokemon.js</w:t>
+        <w:br/>
+        <w:t xml:space="preserve">                    /               \</w:t>
+        <w:br/>
+        <w:t xml:space="preserve">         PokeAPI (axios)      Backend :3000 (axios)</w:t>
+        <w:br/>
+        <w:t xml:space="preserve">                                        |</w:t>
+        <w:br/>
+        <w:t xml:space="preserve">                                      MySQL</w:t>
       </w:r>
     </w:p>
     <w:p>
+      <w:pPr>
+        <w:spacing w:after="160"/>
+      </w:pPr>
       <w:r>
         <w:rPr>
           <w:rFonts w:ascii="Calibri" w:hAnsi="Calibri" w:eastAsia="Calibri"/>
           <w:b w:val="0"/>
           <w:sz w:val="24"/>
         </w:rPr>
-        <w:t>Componentes:</w:t>
+        <w:t>Que hace cada parte:</w:t>
+      </w:r>
+    </w:p>
+    <w:tbl>
+      <w:tblPr>
+        <w:tblStyle w:val="TableGrid"/>
+        <w:tblW w:type="auto" w:w="0"/>
+        <w:tblLook w:firstColumn="1" w:firstRow="1" w:lastColumn="0" w:lastRow="0" w:noHBand="0" w:noVBand="1" w:val="04A0"/>
+      </w:tblPr>
+      <w:tblGrid>
+        <w:gridCol w:w="4816"/>
+        <w:gridCol w:w="4816"/>
+      </w:tblGrid>
+      <w:tr>
+        <w:tc>
+          <w:tcPr>
+            <w:tcW w:type="dxa" w:w="4816"/>
+            <w:shd w:fill="C03014" w:val="clear"/>
+          </w:tcPr>
+          <w:p>
+            <w:r/>
+            <w:r>
+              <w:rPr>
+                <w:rFonts w:ascii="Calibri" w:hAnsi="Calibri" w:eastAsia="Calibri"/>
+                <w:b/>
+                <w:color w:val="FFFFFF"/>
+                <w:sz w:val="22"/>
+              </w:rPr>
+              <w:t>Archivo / componente</w:t>
+            </w:r>
+          </w:p>
+        </w:tc>
+        <w:tc>
+          <w:tcPr>
+            <w:tcW w:type="dxa" w:w="4816"/>
+            <w:shd w:fill="C03014" w:val="clear"/>
+          </w:tcPr>
+          <w:p>
+            <w:r/>
+            <w:r>
+              <w:rPr>
+                <w:rFonts w:ascii="Calibri" w:hAnsi="Calibri" w:eastAsia="Calibri"/>
+                <w:b/>
+                <w:color w:val="FFFFFF"/>
+                <w:sz w:val="22"/>
+              </w:rPr>
+              <w:t>Que hace</w:t>
+            </w:r>
+          </w:p>
+        </w:tc>
+      </w:tr>
+      <w:tr>
+        <w:tc>
+          <w:tcPr>
+            <w:tcW w:type="dxa" w:w="4816"/>
+          </w:tcPr>
+          <w:p>
+            <w:r/>
+            <w:r>
+              <w:rPr>
+                <w:rFonts w:ascii="Calibri" w:hAnsi="Calibri" w:eastAsia="Calibri"/>
+                <w:b/>
+                <w:sz w:val="22"/>
+              </w:rPr>
+              <w:t>Listado.vue</w:t>
+            </w:r>
+          </w:p>
+        </w:tc>
+        <w:tc>
+          <w:tcPr>
+            <w:tcW w:type="dxa" w:w="4816"/>
+          </w:tcPr>
+          <w:p>
+            <w:r/>
+            <w:r>
+              <w:rPr>
+                <w:rFonts w:ascii="Calibri" w:hAnsi="Calibri" w:eastAsia="Calibri"/>
+                <w:b w:val="0"/>
+                <w:sz w:val="22"/>
+              </w:rPr>
+              <w:t>onMounted carga la lista, el buscador y recorre los pokemones con v-for. La funcion elegir() los manda a Pinia.</w:t>
+            </w:r>
+          </w:p>
+        </w:tc>
+      </w:tr>
+      <w:tr>
+        <w:tc>
+          <w:tcPr>
+            <w:tcW w:type="dxa" w:w="4816"/>
+          </w:tcPr>
+          <w:p>
+            <w:r/>
+            <w:r>
+              <w:rPr>
+                <w:rFonts w:ascii="Calibri" w:hAnsi="Calibri" w:eastAsia="Calibri"/>
+                <w:b/>
+                <w:sz w:val="22"/>
+              </w:rPr>
+              <w:t>PokemonCard.vue</w:t>
+            </w:r>
+          </w:p>
+        </w:tc>
+        <w:tc>
+          <w:tcPr>
+            <w:tcW w:type="dxa" w:w="4816"/>
+          </w:tcPr>
+          <w:p>
+            <w:r/>
+            <w:r>
+              <w:rPr>
+                <w:rFonts w:ascii="Calibri" w:hAnsi="Calibri" w:eastAsia="Calibri"/>
+                <w:b w:val="0"/>
+                <w:sz w:val="22"/>
+              </w:rPr>
+              <w:t>Tarjeta de un pokemon: imagen, tipos y habilidades. Al hacer click se elige o se saca.</w:t>
+            </w:r>
+          </w:p>
+        </w:tc>
+      </w:tr>
+      <w:tr>
+        <w:tc>
+          <w:tcPr>
+            <w:tcW w:type="dxa" w:w="4816"/>
+          </w:tcPr>
+          <w:p>
+            <w:r/>
+            <w:r>
+              <w:rPr>
+                <w:rFonts w:ascii="Calibri" w:hAnsi="Calibri" w:eastAsia="Calibri"/>
+                <w:b/>
+                <w:sz w:val="22"/>
+              </w:rPr>
+              <w:t>Equipo.vue</w:t>
+            </w:r>
+          </w:p>
+        </w:tc>
+        <w:tc>
+          <w:tcPr>
+            <w:tcW w:type="dxa" w:w="4816"/>
+          </w:tcPr>
+          <w:p>
+            <w:r/>
+            <w:r>
+              <w:rPr>
+                <w:rFonts w:ascii="Calibri" w:hAnsi="Calibri" w:eastAsia="Calibri"/>
+                <w:b w:val="0"/>
+                <w:sz w:val="22"/>
+              </w:rPr>
+              <w:t>Muestra el equipo personal, guarda con POST y lista los equipos con GET.</w:t>
+            </w:r>
+          </w:p>
+        </w:tc>
+      </w:tr>
+      <w:tr>
+        <w:tc>
+          <w:tcPr>
+            <w:tcW w:type="dxa" w:w="4816"/>
+          </w:tcPr>
+          <w:p>
+            <w:r/>
+            <w:r>
+              <w:rPr>
+                <w:rFonts w:ascii="Calibri" w:hAnsi="Calibri" w:eastAsia="Calibri"/>
+                <w:b/>
+                <w:sz w:val="22"/>
+              </w:rPr>
+              <w:t>Pinia_Pokemon.js</w:t>
+            </w:r>
+          </w:p>
+        </w:tc>
+        <w:tc>
+          <w:tcPr>
+            <w:tcW w:type="dxa" w:w="4816"/>
+          </w:tcPr>
+          <w:p>
+            <w:r/>
+            <w:r>
+              <w:rPr>
+                <w:rFonts w:ascii="Calibri" w:hAnsi="Calibri" w:eastAsia="Calibri"/>
+                <w:b w:val="0"/>
+                <w:sz w:val="22"/>
+              </w:rPr>
+              <w:t>Store. Ahi esta el state, el getter del filtro y las actions asincronicas.</w:t>
+            </w:r>
+          </w:p>
+        </w:tc>
+      </w:tr>
+    </w:tbl>
+    <w:p/>
+    <w:p>
+      <w:pPr>
+        <w:spacing w:after="160"/>
+      </w:pPr>
+      <w:r>
+        <w:rPr>
+          <w:rFonts w:ascii="Calibri" w:hAnsi="Calibri" w:eastAsia="Calibri"/>
+          <w:b w:val="0"/>
+          <w:sz w:val="24"/>
+        </w:rPr>
+        <w:t>Store de Pinia (PokemonPinia):</w:t>
       </w:r>
     </w:p>
     <w:p>
@@ -292,7 +705,7 @@
           <w:b w:val="0"/>
           <w:sz w:val="24"/>
         </w:rPr>
-        <w:t>Listado.vue: carga los pokemones y el buscador</w:t>
+        <w:t>State: listaPokemon, seleccionados (equipoPersonal), busqueda y equiposGuardados</w:t>
       </w:r>
     </w:p>
     <w:p>
@@ -305,7 +718,7 @@
           <w:b w:val="0"/>
           <w:sz w:val="24"/>
         </w:rPr>
-        <w:t>PokemonCard.vue: la tarjeta con la foto, el tipo y las habilidades</w:t>
+        <w:t>Getter: pokemonFiltrados. Filtra por nombre mientras se escribe</w:t>
       </w:r>
     </w:p>
     <w:p>
@@ -318,68 +731,151 @@
           <w:b w:val="0"/>
           <w:sz w:val="24"/>
         </w:rPr>
-        <w:t>Equipo.vue: el equipo, el boton de guardar y los equipos de la base</w:t>
+        <w:t>Actions: cargarListaPokemon, guardarPokemon, quitarPokemon, guardarEquipoEnBD y cargarEquiposDeBD</w:t>
       </w:r>
     </w:p>
     <w:p>
+      <w:pPr>
+        <w:spacing w:after="160"/>
+      </w:pPr>
       <w:r>
         <w:rPr>
           <w:rFonts w:ascii="Calibri" w:hAnsi="Calibri" w:eastAsia="Calibri"/>
           <w:b w:val="0"/>
           <w:sz w:val="24"/>
         </w:rPr>
-        <w:t>En pinia tenemos listaPokemon, seleccionados (el equipo), la busqueda y los equipos que ya estan guardados. El getter pokemonFiltrados es el que filtra cuando escribis. Las functions async estan en el store porque el profe dijo que las actions tenian que hacer las llamadas.</w:t>
+        <w:t>Los dos componentes usan const Pinia = PokemonPinia(), por eso ven el mismo equipo. Si agrego un pokemon en el listado, Equipo.vue se actualiza solo.</w:t>
       </w:r>
     </w:p>
     <w:p>
+      <w:pPr>
+        <w:spacing w:before="280" w:after="160"/>
+      </w:pPr>
       <w:r>
         <w:rPr>
           <w:rFonts w:ascii="Calibri" w:hAnsi="Calibri" w:eastAsia="Calibri"/>
           <w:b/>
-          <w:color w:val="B42814"/>
+          <w:color w:val="C03014"/>
           <w:sz w:val="32"/>
         </w:rPr>
-        <w:t>3. Coneccion API y base de datos</w:t>
+        <w:t>3. Conexion API / BD</w:t>
       </w:r>
     </w:p>
     <w:p>
+      <w:pPr>
+        <w:spacing w:after="160"/>
+      </w:pPr>
       <w:r>
         <w:rPr>
           <w:rFonts w:ascii="Calibri" w:hAnsi="Calibri" w:eastAsia="Calibri"/>
           <w:b w:val="0"/>
           <w:sz w:val="24"/>
         </w:rPr>
-        <w:t>Cuando se abre Listado.vue, onMounted llama a cargarListaPokemon(). Ahi hacemos el get a https://pokeapi.co/api/v2/pokemon?limit=151. Eso solo trae el nombre y la url, no trae la imagen ni los tipos. Por eso despues hacemos otro get a cada url, ahi si viene la foto, los tipos y las habilidades. Eso tarda un toque porque son 151.</w:t>
+        <w:t>Toda la logica asincronica esta en las actions de Pinia, como pedia la rubrica. Los componentes solo llaman a esas funciones.</w:t>
       </w:r>
     </w:p>
     <w:p>
+      <w:pPr>
+        <w:spacing w:after="160"/>
+      </w:pPr>
       <w:r>
         <w:rPr>
           <w:rFonts w:ascii="Calibri" w:hAnsi="Calibri" w:eastAsia="Calibri"/>
           <w:b w:val="0"/>
           <w:sz w:val="24"/>
         </w:rPr>
-        <w:t>Para no esperar de a uno usamos Promise.all. Cuando termina se guarda todo en listaPokemon. El buscador esta con v-model en Pinia.busqueda y el getter va filtrando.</w:t>
+        <w:t>3.1 Llamada a la PokeAPI</w:t>
       </w:r>
     </w:p>
     <w:p>
+      <w:pPr>
+        <w:spacing w:after="160"/>
+      </w:pPr>
       <w:r>
         <w:rPr>
           <w:rFonts w:ascii="Calibri" w:hAnsi="Calibri" w:eastAsia="Calibri"/>
           <w:b w:val="0"/>
           <w:sz w:val="24"/>
         </w:rPr>
-        <w:t>Si haces click en una carta, la funcion elegir mira si ya esta en el equipo. Si no esta lo agrega con guardarPokemon (es un push). Si ya esta lo saca. No dejamos mas de 6 porque sino era cualquiera.</w:t>
+        <w:t>Cuando se monta Listado.vue se ejecuta onMounted y se llama a cargarListaPokemon(). Primero se hace un GET a https://pokeapi.co/api/v2/pokemon?limit=151. Esa respuesta trae solo name y url, no trae la imagen ni los tipos.</w:t>
       </w:r>
     </w:p>
     <w:p>
+      <w:pPr>
+        <w:spacing w:after="160"/>
+      </w:pPr>
       <w:r>
         <w:rPr>
           <w:rFonts w:ascii="Calibri" w:hAnsi="Calibri" w:eastAsia="Calibri"/>
           <w:b w:val="0"/>
           <w:sz w:val="24"/>
         </w:rPr>
-        <w:t>El back esta en localhost:3000 y el front en 5173. Por eso hay que poner cors, si no el navegador no deja. La tabla equipos tiene id, nombre, pokemones (json) y fecha_creacion.</w:t>
+        <w:t>Por eso hacemos una segunda llamada a poke.url por cada pokemon, para obtener imagen, tipos y habilidades. Las 151 se disparan en paralelo con Promise.all para que no tarde tanto. Cuando terminan se guardan en listaPokemon.</w:t>
+      </w:r>
+    </w:p>
+    <w:p>
+      <w:pPr>
+        <w:spacing w:after="160"/>
+      </w:pPr>
+      <w:r>
+        <w:rPr>
+          <w:rFonts w:ascii="Calibri" w:hAnsi="Calibri" w:eastAsia="Calibri"/>
+          <w:b w:val="0"/>
+          <w:sz w:val="24"/>
+        </w:rPr>
+        <w:t>El buscador esta unido con v-model a Pinia.busqueda. El getter pokemonFiltrados usa esa variable y filtra la lista en tiempo real, sin volver a pegarle a la API.</w:t>
+      </w:r>
+    </w:p>
+    <w:p>
+      <w:pPr>
+        <w:spacing w:after="160"/>
+      </w:pPr>
+      <w:r>
+        <w:rPr>
+          <w:rFonts w:ascii="Calibri" w:hAnsi="Calibri" w:eastAsia="Calibri"/>
+          <w:b w:val="0"/>
+          <w:sz w:val="24"/>
+        </w:rPr>
+        <w:t>3.2 Equipo personal</w:t>
+      </w:r>
+    </w:p>
+    <w:p>
+      <w:pPr>
+        <w:spacing w:after="160"/>
+      </w:pPr>
+      <w:r>
+        <w:rPr>
+          <w:rFonts w:ascii="Calibri" w:hAnsi="Calibri" w:eastAsia="Calibri"/>
+          <w:b w:val="0"/>
+          <w:sz w:val="24"/>
+        </w:rPr>
+        <w:t>Si el usuario hace click en una tarjeta, elegir(i) mira si ese pokemon ya esta en seleccionados. Si no esta, llama a guardarPokemon (hace push). Si ya esta, lo saca. El maximo es 6.</w:t>
+      </w:r>
+    </w:p>
+    <w:p>
+      <w:pPr>
+        <w:spacing w:after="160"/>
+      </w:pPr>
+      <w:r>
+        <w:rPr>
+          <w:rFonts w:ascii="Calibri" w:hAnsi="Calibri" w:eastAsia="Calibri"/>
+          <w:b w:val="0"/>
+          <w:sz w:val="24"/>
+        </w:rPr>
+        <w:t>3.3 Guardado en MySQL</w:t>
+      </w:r>
+    </w:p>
+    <w:p>
+      <w:pPr>
+        <w:spacing w:after="160"/>
+      </w:pPr>
+      <w:r>
+        <w:rPr>
+          <w:rFonts w:ascii="Calibri" w:hAnsi="Calibri" w:eastAsia="Calibri"/>
+          <w:b w:val="0"/>
+          <w:sz w:val="24"/>
+        </w:rPr>
+        <w:t>El backend corre en localhost:3000 y el frontend en localhost:5173. Cors deja que el navegador hable entre esos dos puertos. La tabla equipos tiene id, nombre, pokemones (JSON) y fecha_creacion.</w:t>
       </w:r>
     </w:p>
     <w:p>
@@ -392,7 +888,7 @@
           <w:b w:val="0"/>
           <w:sz w:val="24"/>
         </w:rPr>
-        <w:t>GET /api/listado: trae los equipos, se usa cuando arranca Equipo.vue</w:t>
+        <w:t>GET /api/listado: SELECT * FROM equipos. Se usa al iniciar Equipo.vue para cargar lo guardado.</w:t>
       </w:r>
     </w:p>
     <w:p>
@@ -405,58 +901,73 @@
           <w:b w:val="0"/>
           <w:sz w:val="24"/>
         </w:rPr>
-        <w:t>POST /api/guardar: inserta el nombre y el array de pokemones</w:t>
+        <w:t>POST /api/guardar: INSERT del nombre y del array seleccionados pasado a JSON.</w:t>
       </w:r>
     </w:p>
     <w:p>
+      <w:pPr>
+        <w:spacing w:after="160"/>
+      </w:pPr>
       <w:r>
         <w:rPr>
           <w:rFonts w:ascii="Calibri" w:hAnsi="Calibri" w:eastAsia="Calibri"/>
           <w:b w:val="0"/>
           <w:sz w:val="24"/>
         </w:rPr>
-        <w:t>En pinia, guardarEquipoEnBD arma nuevoEquipo y hace el post. cargarEquiposDeBD hace el get. Asi cumplimos lo de cargar y guardar.</w:t>
+        <w:t>En Pinia, guardarEquipoEnBD arma el objeto nuevoEquipo y hace axios.post a http://localhost:3000/api/guardar. Despues llama a cargarEquiposDeBD, que hace axios.get a /api/listado y llena equiposGuardados. Asi se cumple el CRUD minimo: cargar (GET) y guardar (POST).</w:t>
       </w:r>
     </w:p>
     <w:p>
+      <w:pPr>
+        <w:spacing w:before="280" w:after="160"/>
+      </w:pPr>
       <w:r>
         <w:rPr>
           <w:rFonts w:ascii="Calibri" w:hAnsi="Calibri" w:eastAsia="Calibri"/>
           <w:b/>
-          <w:color w:val="B42814"/>
+          <w:color w:val="C03014"/>
           <w:sz w:val="32"/>
         </w:rPr>
         <w:t>4. Conclusion</w:t>
       </w:r>
     </w:p>
     <w:p>
+      <w:pPr>
+        <w:spacing w:after="160"/>
+      </w:pPr>
       <w:r>
         <w:rPr>
           <w:rFonts w:ascii="Calibri" w:hAnsi="Calibri" w:eastAsia="Calibri"/>
           <w:b w:val="0"/>
           <w:sz w:val="24"/>
         </w:rPr>
-        <w:t>Al final nos salio la pagina y se entiende bastante. Lo que mas me quedo es que pinia sirve para que el listado y el equipo vean lo mismo sin estar pasando datos de un lado al otro.</w:t>
+        <w:t>Pudimos armar una SPA que consume una API real, guarda el estado en Pinia y persiste el equipo en MySQL. Lo mas importante que vimos es la diferencia entre un dato local de un componente y un dato global de la store: Listado y Equipo ven el mismo equipo porque ambos usan PokemonPinia().</w:t>
       </w:r>
     </w:p>
     <w:p>
+      <w:pPr>
+        <w:spacing w:after="160"/>
+      </w:pPr>
       <w:r>
         <w:rPr>
           <w:rFonts w:ascii="Calibri" w:hAnsi="Calibri" w:eastAsia="Calibri"/>
           <w:b w:val="0"/>
           <w:sz w:val="24"/>
         </w:rPr>
-        <w:t>Tambien vimos lo de async/await, porque la api tarda y si no usas eso se traba o no llega a mostrar nada.</w:t>
+        <w:t>Tambien entendimos para que sirve una llamada asincronica: la PokeAPI tarda, entonces usamos async/await para no trabar la pagina y mostramos un mensaje de carga.</w:t>
       </w:r>
     </w:p>
     <w:p>
+      <w:pPr>
+        <w:spacing w:after="160"/>
+      </w:pPr>
       <w:r>
         <w:rPr>
           <w:rFonts w:ascii="Calibri" w:hAnsi="Calibri" w:eastAsia="Calibri"/>
           <w:b w:val="0"/>
           <w:sz w:val="24"/>
         </w:rPr>
-        <w:t>Dificultades:</w:t>
+        <w:t>Dificultades encontradas:</w:t>
       </w:r>
     </w:p>
     <w:p>
@@ -469,7 +980,7 @@
           <w:b w:val="0"/>
           <w:sz w:val="24"/>
         </w:rPr>
-        <w:t>Al principio no entendia porque no venia la imagen, hasta que vimos que habia que hacer el segundo get</w:t>
+        <w:t>La lista de la PokeAPI no trae la imagen. Hubo que hacer el segundo GET de cada pokemon.</w:t>
       </w:r>
     </w:p>
     <w:p>
@@ -482,7 +993,7 @@
           <w:b w:val="0"/>
           <w:sz w:val="24"/>
         </w:rPr>
-        <w:t>Nos costo lo de cors, el front y el back estan en distintos puertos</w:t>
+        <w:t>El frontend y el backend estan en puertos distintos, por eso hay que usar cors.</w:t>
       </w:r>
     </w:p>
     <w:p>
@@ -495,28 +1006,47 @@
           <w:b w:val="0"/>
           <w:sz w:val="24"/>
         </w:rPr>
-        <w:t>Si no prendias xampp el server.js no conectaba a mysql</w:t>
+        <w:t>MySQL tiene que estar prendido antes de levantar node server.js, si no no guarda.</w:t>
       </w:r>
     </w:p>
     <w:p>
+      <w:pPr>
+        <w:spacing w:after="160"/>
+      </w:pPr>
       <w:r>
         <w:rPr>
           <w:rFonts w:ascii="Calibri" w:hAnsi="Calibri" w:eastAsia="Calibri"/>
           <w:b w:val="0"/>
           <w:sz w:val="24"/>
         </w:rPr>
-        <w:t>El trabajo lo fuimos haciendo entre todos, uno mas en el front, otro en el back y otro en el informe. Despues lo juntamos y lo probamos.</w:t>
+        <w:t>Aprendimos a separar la interfaz en componentes, a meter las llamadas HTTP en las actions de Pinia y a conectar Vue con un backend simple. El codigo quedo en GitHub para que se pueda ver y levantar con npm install y npm run dev.</w:t>
       </w:r>
     </w:p>
     <w:p>
+      <w:pPr>
+        <w:spacing w:before="280" w:after="160"/>
+      </w:pPr>
       <w:r>
         <w:rPr>
           <w:rFonts w:ascii="Calibri" w:hAnsi="Calibri" w:eastAsia="Calibri"/>
           <w:b/>
-          <w:color w:val="B42814"/>
+          <w:color w:val="C03014"/>
           <w:sz w:val="32"/>
         </w:rPr>
-        <w:t>5. Como levantarlo</w:t>
+        <w:t>5. Repositorio y como levantarlo</w:t>
+      </w:r>
+    </w:p>
+    <w:p>
+      <w:pPr>
+        <w:spacing w:after="160"/>
+      </w:pPr>
+      <w:r>
+        <w:rPr>
+          <w:rFonts w:ascii="Calibri" w:hAnsi="Calibri" w:eastAsia="Calibri"/>
+          <w:b w:val="0"/>
+          <w:sz w:val="24"/>
+        </w:rPr>
+        <w:t>Repositorio: https://github.com/alejomcorti/pokedex</w:t>
       </w:r>
     </w:p>
     <w:p>
@@ -529,7 +1059,7 @@
           <w:b w:val="0"/>
           <w:sz w:val="24"/>
         </w:rPr>
-        <w:t>importar backend/pokedex.sql en phpmyadmin</w:t>
+        <w:t>Importar backend/pokedex.sql en phpMyAdmin (o MySQL)</w:t>
       </w:r>
     </w:p>
     <w:p>
@@ -542,7 +1072,7 @@
           <w:b w:val="0"/>
           <w:sz w:val="24"/>
         </w:rPr>
-        <w:t>en backend: npm install y node server.js</w:t>
+        <w:t>Backend: cd backend, npm install, node server.js</w:t>
       </w:r>
     </w:p>
     <w:p>
@@ -555,7 +1085,7 @@
           <w:b w:val="0"/>
           <w:sz w:val="24"/>
         </w:rPr>
-        <w:t>en la carpeta del proyecto: npm install y npm run dev</w:t>
+        <w:t>Frontend: npm install, npm run dev</w:t>
       </w:r>
     </w:p>
     <w:p>
@@ -568,22 +1098,12 @@
           <w:b w:val="0"/>
           <w:sz w:val="24"/>
         </w:rPr>
-        <w:t>abrir localhost:5173</w:t>
-      </w:r>
-    </w:p>
-    <w:p>
-      <w:r>
-        <w:rPr>
-          <w:rFonts w:ascii="Calibri" w:hAnsi="Calibri" w:eastAsia="Calibri"/>
-          <w:b w:val="0"/>
-          <w:sz w:val="24"/>
-        </w:rPr>
-        <w:t>Falta poner los nombres de verdad en la portada.</w:t>
+        <w:t>Abrir http://localhost:5173</w:t>
       </w:r>
     </w:p>
     <w:sectPr>
       <w:pgSz w:w="12240" w:h="15840"/>
-      <w:pgMar w:top="1134" w:right="1417" w:bottom="1134" w:left="1417" w:header="720" w:footer="720" w:gutter="0"/>
+      <w:pgMar w:top="1134" w:right="1304" w:bottom="1134" w:left="1304" w:header="720" w:footer="720" w:gutter="0"/>
       <w:cols w:space="720"/>
       <w:docGrid w:linePitch="360"/>
     </w:sectPr>

</xml_diff>